<commit_message>
Update modules 3 and 4 content and images
</commit_message>
<xml_diff>
--- a/files/w1.docx
+++ b/files/w1.docx
@@ -2,7 +2,6 @@
 <file path=word/document.xml><?xml version="1.0" encoding="utf-8"?>
 <w:document xmlns:wpc="http://schemas.microsoft.com/office/word/2010/wordprocessingCanvas" xmlns:mc="http://schemas.openxmlformats.org/markup-compatibility/2006" xmlns:o="urn:schemas-microsoft-com:office:office" xmlns:r="http://schemas.openxmlformats.org/officeDocument/2006/relationships" xmlns:m="http://schemas.openxmlformats.org/officeDocument/2006/math" xmlns:v="urn:schemas-microsoft-com:vml" xmlns:wp14="http://schemas.microsoft.com/office/word/2010/wordprocessingDrawing" xmlns:wp="http://schemas.openxmlformats.org/drawingml/2006/wordprocessingDrawing" xmlns:w10="urn:schemas-microsoft-com:office:word" xmlns:w="http://schemas.openxmlformats.org/wordprocessingml/2006/main" xmlns:w14="http://schemas.microsoft.com/office/word/2010/wordml" xmlns:wpg="http://schemas.microsoft.com/office/word/2010/wordprocessingGroup" xmlns:wpi="http://schemas.microsoft.com/office/word/2010/wordprocessingInk" xmlns:wne="http://schemas.microsoft.com/office/word/2006/wordml" xmlns:wps="http://schemas.microsoft.com/office/word/2010/wordprocessingShape" mc:Ignorable="w14 wp14">
   <w:body>
-    <w:bookmarkStart w:id="0" w:name="_GoBack"/>
     <w:p>
       <w:pPr>
         <w:rPr>
@@ -15,44 +14,75 @@
       </w:pPr>
       <w:r>
         <w:rPr>
-          <w:sz w:val="40"/>
-          <w:szCs w:val="40"/>
-          <w:lang w:bidi="ar-EG"/>
-        </w:rPr>
-        <w:fldChar w:fldCharType="begin"/>
-      </w:r>
-      <w:r>
-        <w:rPr>
-          <w:sz w:val="40"/>
-          <w:szCs w:val="40"/>
-          <w:lang w:bidi="ar-EG"/>
-        </w:rPr>
-        <w:instrText xml:space="preserve"> HYPERLINK "https://courselab.software.informer.com/download/?ca1acdfa" </w:instrText>
-      </w:r>
-      <w:r>
-        <w:rPr>
-          <w:sz w:val="40"/>
-          <w:szCs w:val="40"/>
-          <w:lang w:bidi="ar-EG"/>
-        </w:rPr>
-        <w:fldChar w:fldCharType="separate"/>
-      </w:r>
-      <w:r>
-        <w:rPr>
-          <w:rStyle w:val="Hyperlink"/>
-          <w:sz w:val="40"/>
-          <w:szCs w:val="40"/>
-          <w:lang w:bidi="ar-EG"/>
-        </w:rPr>
-        <w:t>https://courselab.software.informer.com/download/?ca1acdfa</w:t>
-      </w:r>
-      <w:r>
-        <w:rPr>
-          <w:sz w:val="40"/>
-          <w:szCs w:val="40"/>
-          <w:lang w:bidi="ar-EG"/>
-        </w:rPr>
-        <w:fldChar w:fldCharType="end"/>
+          <w:rFonts w:hint="cs"/>
+          <w:sz w:val="40"/>
+          <w:szCs w:val="40"/>
+          <w:rtl/>
+          <w:lang w:bidi="ar-EG"/>
+        </w:rPr>
+        <w:t>بعد ال</w:t>
+      </w:r>
+      <w:r>
+        <w:rPr>
+          <w:rFonts w:hint="cs"/>
+          <w:sz w:val="40"/>
+          <w:szCs w:val="40"/>
+          <w:rtl/>
+          <w:lang w:bidi="ar-EG"/>
+        </w:rPr>
+        <w:t>نق</w:t>
+      </w:r>
+      <w:r>
+        <w:rPr>
+          <w:rFonts w:hint="cs"/>
+          <w:sz w:val="40"/>
+          <w:szCs w:val="40"/>
+          <w:rtl/>
+          <w:lang w:bidi="ar-EG"/>
+        </w:rPr>
+        <w:t>ر على الرابط (</w:t>
+      </w:r>
+      <w:proofErr w:type="spellStart"/>
+      <w:r>
+        <w:rPr>
+          <w:rFonts w:hint="cs"/>
+          <w:sz w:val="40"/>
+          <w:szCs w:val="40"/>
+          <w:rtl/>
+          <w:lang w:bidi="ar-EG"/>
+        </w:rPr>
+        <w:t>الهايبر</w:t>
+      </w:r>
+      <w:proofErr w:type="spellEnd"/>
+      <w:r>
+        <w:rPr>
+          <w:rFonts w:hint="cs"/>
+          <w:sz w:val="40"/>
+          <w:szCs w:val="40"/>
+          <w:rtl/>
+          <w:lang w:bidi="ar-EG"/>
+        </w:rPr>
+        <w:t xml:space="preserve"> لينك)</w:t>
+      </w:r>
+      <w:r>
+        <w:rPr>
+          <w:rFonts w:hint="cs"/>
+          <w:sz w:val="40"/>
+          <w:szCs w:val="40"/>
+          <w:rtl/>
+          <w:lang w:bidi="ar-EG"/>
+        </w:rPr>
+        <w:t xml:space="preserve"> و</w:t>
+      </w:r>
+      <w:r>
+        <w:rPr>
+          <w:rFonts w:hint="cs"/>
+          <w:sz w:val="40"/>
+          <w:szCs w:val="40"/>
+          <w:rtl/>
+          <w:lang w:bidi="ar-EG"/>
+        </w:rPr>
+        <w:t>الضغط على</w:t>
       </w:r>
       <w:r>
         <w:rPr>
@@ -64,38 +94,26 @@
         </w:rPr>
         <w:t xml:space="preserve"> </w:t>
       </w:r>
-    </w:p>
-    <w:bookmarkEnd w:id="0"/>
-    <w:p>
-      <w:pPr>
-        <w:rPr>
-          <w:rFonts w:hint="cs"/>
-          <w:sz w:val="40"/>
-          <w:szCs w:val="40"/>
-          <w:rtl/>
-          <w:lang w:bidi="ar-EG"/>
-        </w:rPr>
-      </w:pPr>
-      <w:r>
-        <w:rPr>
-          <w:rFonts w:hint="cs"/>
-          <w:sz w:val="40"/>
-          <w:szCs w:val="40"/>
-          <w:rtl/>
-          <w:lang w:bidi="ar-EG"/>
-        </w:rPr>
-        <w:t xml:space="preserve">نقوم بالضغط على هذا الرابط </w:t>
-      </w:r>
-      <w:r>
-        <w:rPr>
-          <w:rFonts w:hint="cs"/>
-          <w:sz w:val="40"/>
-          <w:szCs w:val="40"/>
-          <w:rtl/>
-          <w:lang w:bidi="ar-EG"/>
-        </w:rPr>
-        <w:t xml:space="preserve">حيث </w:t>
-      </w:r>
+      <w:r>
+        <w:rPr>
+          <w:sz w:val="40"/>
+          <w:szCs w:val="40"/>
+          <w:lang w:bidi="ar-EG"/>
+        </w:rPr>
+        <w:t>enter</w:t>
+      </w:r>
+      <w:r>
+        <w:rPr>
+          <w:rFonts w:hint="cs"/>
+          <w:sz w:val="40"/>
+          <w:szCs w:val="40"/>
+          <w:rtl/>
+          <w:lang w:bidi="ar-EG"/>
+        </w:rPr>
+        <w:t xml:space="preserve"> </w:t>
+      </w:r>
+      <w:bookmarkStart w:id="0" w:name="_GoBack"/>
+      <w:bookmarkEnd w:id="0"/>
       <w:r>
         <w:rPr>
           <w:rFonts w:hint="cs"/>
@@ -148,7 +166,6 @@
     <w:p>
       <w:pPr>
         <w:rPr>
-          <w:rFonts w:hint="cs"/>
           <w:rtl/>
           <w:lang w:bidi="ar-EG"/>
         </w:rPr>
@@ -157,7 +174,6 @@
     <w:p>
       <w:pPr>
         <w:rPr>
-          <w:rFonts w:hint="cs"/>
           <w:rtl/>
           <w:lang w:bidi="ar-EG"/>
         </w:rPr>
@@ -206,7 +222,6 @@
     <w:p>
       <w:pPr>
         <w:rPr>
-          <w:rFonts w:hint="cs"/>
           <w:rtl/>
           <w:lang w:bidi="ar-EG"/>
         </w:rPr>
@@ -215,7 +230,6 @@
     <w:p>
       <w:pPr>
         <w:rPr>
-          <w:rFonts w:hint="cs"/>
           <w:sz w:val="40"/>
           <w:szCs w:val="40"/>
           <w:rtl/>
@@ -296,7 +310,6 @@
     <w:p>
       <w:pPr>
         <w:rPr>
-          <w:rFonts w:hint="cs"/>
           <w:sz w:val="40"/>
           <w:szCs w:val="40"/>
           <w:rtl/>
@@ -347,7 +360,6 @@
     <w:p>
       <w:pPr>
         <w:rPr>
-          <w:rFonts w:hint="cs"/>
           <w:sz w:val="40"/>
           <w:szCs w:val="40"/>
           <w:rtl/>
@@ -362,7 +374,6 @@
           <w:rtl/>
           <w:lang w:bidi="ar-EG"/>
         </w:rPr>
-        <w:lastRenderedPageBreak/>
         <w:t xml:space="preserve">نقوم بفك الضغط بالنقر </w:t>
       </w:r>
       <w:r>
@@ -389,7 +400,6 @@
     <w:p>
       <w:pPr>
         <w:rPr>
-          <w:rFonts w:hint="cs"/>
           <w:sz w:val="40"/>
           <w:szCs w:val="40"/>
           <w:rtl/>
@@ -401,7 +411,6 @@
       <w:pPr>
         <w:jc w:val="center"/>
         <w:rPr>
-          <w:rFonts w:hint="cs"/>
           <w:sz w:val="40"/>
           <w:szCs w:val="40"/>
           <w:rtl/>
@@ -438,14 +447,13 @@
           <v:shape id="_x0000_i1025" type="#_x0000_t75" style="width:211.25pt;height:105.25pt" o:ole="">
             <v:imagedata r:id="rId8" o:title=""/>
           </v:shape>
-          <o:OLEObject Type="Embed" ProgID="Package" ShapeID="_x0000_i1025" DrawAspect="Content" ObjectID="_1843969437" r:id="rId9"/>
+          <o:OLEObject Type="Embed" ProgID="Package" ShapeID="_x0000_i1025" DrawAspect="Content" ObjectID="_1850780039" r:id="rId9"/>
         </w:object>
       </w:r>
     </w:p>
     <w:p>
       <w:pPr>
         <w:rPr>
-          <w:rFonts w:hint="cs"/>
           <w:sz w:val="40"/>
           <w:szCs w:val="40"/>
           <w:rtl/>
@@ -466,7 +474,6 @@
     <w:p>
       <w:pPr>
         <w:rPr>
-          <w:rFonts w:hint="cs"/>
           <w:sz w:val="40"/>
           <w:szCs w:val="40"/>
           <w:rtl/>
@@ -477,7 +484,6 @@
     <w:p>
       <w:pPr>
         <w:rPr>
-          <w:rFonts w:hint="cs"/>
           <w:sz w:val="40"/>
           <w:szCs w:val="40"/>
           <w:lang w:bidi="ar-EG"/>
@@ -1331,7 +1337,7 @@
 </file>
 
 <file path=customXml/itemProps1.xml><?xml version="1.0" encoding="utf-8"?>
-<ds:datastoreItem xmlns:ds="http://schemas.openxmlformats.org/officeDocument/2006/customXml" ds:itemID="{B9A34AC0-CA11-4D30-87DE-092AC294D6ED}">
+<ds:datastoreItem xmlns:ds="http://schemas.openxmlformats.org/officeDocument/2006/customXml" ds:itemID="{3812D0D3-1D2E-4302-B26D-0C0E04EC4FF3}">
   <ds:schemaRefs>
     <ds:schemaRef ds:uri="http://schemas.openxmlformats.org/officeDocument/2006/bibliography"/>
   </ds:schemaRefs>

</xml_diff>